<commit_message>
Resumen con las correcciones de Sol (tesis, PDF y Word para la catedra)
Co-Authored-By: Claude Opus 5.5 <noreply@anthropic.com>
</commit_message>
<xml_diff>
--- a/entregas/Resumen_catedra.docx
+++ b/entregas/Resumen_catedra.docx
@@ -221,7 +221,39 @@
         <w:pStyle w:val="Justificado"/>
       </w:pPr>
       <w:r>
-        <w:t xml:space="preserve">El consumo de bebidas endulzadas con edulcorantes no calóricos ha crecido exponencialmente; sin embargo, poco se conocen sus efectos a largo plazo. En este estudio se investigaron los efectos neurobiológicos a largo plazo del acceso ilimitado a una bebida endulzada con stevia durante la etapa juvenil (PD25) o la adultez (PD75) de ratas macho Sprague-Dawley. Estos efectos se compararon con los de una bebida con sacarosa, que, según estudios previos del laboratorio, produce alteraciones duraderas de la ansiedad y la memoria. Tras 25 días de tratamiento y 25 días de acceso exclusivo a agua, se evaluaron la conducta tipo ansiosa (</w:t>
+        <w:t xml:space="preserve">El consumo de bebidas endulzadas con edulcorantes no calóricos ha crecido exponencialmente; sin embargo, poco se conocen sus efectos a largo plazo. Este estudio comparó los efectos neurobiológicos a largo plazo de una bebida endulzada con stevia con los de una con sacarosa, que, según demostraron estudios previos del laboratorio y de otros grupos, produce alteraciones duraderas de la ansiedad y la memoria. Ratas macho Sprague-Dawley juveniles (PD25) o adultas (PD75) tuvieron acceso</w:t>
+      </w:r>
+      <w:r>
+        <w:t xml:space="preserve"> </w:t>
+      </w:r>
+      <w:r>
+        <w:rPr>
+          <w:iCs/>
+          <w:i/>
+        </w:rPr>
+        <w:t xml:space="preserve">ad libitum</w:t>
+      </w:r>
+      <w:r>
+        <w:t xml:space="preserve"> </w:t>
+      </w:r>
+      <w:r>
+        <w:t xml:space="preserve">durante 25 días a agua (control) o, además, a sacarosa al 10 % (p/v) o a un extracto de</w:t>
+      </w:r>
+      <w:r>
+        <w:t xml:space="preserve"> </w:t>
+      </w:r>
+      <w:r>
+        <w:rPr>
+          <w:iCs/>
+          <w:i/>
+        </w:rPr>
+        <w:t xml:space="preserve">Stevia rebaudiana</w:t>
+      </w:r>
+      <w:r>
+        <w:t xml:space="preserve"> </w:t>
+      </w:r>
+      <w:r>
+        <w:t xml:space="preserve">Bertoni al 4 % (v/v), y luego solo a agua durante otros 25 días. Después se evaluaron la conducta tipo ansiosa (</w:t>
       </w:r>
       <w:r>
         <w:rPr>
@@ -231,7 +263,7 @@
         <w:t xml:space="preserve">open field</w:t>
       </w:r>
       <w:r>
-        <w:t xml:space="preserve">), la memoria de reconocimiento (NOR), la separación de patrones espaciales (SLR) y la neurogénesis hipocampal (PCNA y DCX). Además, se aplicó un análisis multivariado con aprendizaje automático sobre las métricas registradas con AnyMaze©.</w:t>
+        <w:t xml:space="preserve">), la memoria de reconocimiento (NOR), la separación de patrones espaciales (SLR) y la neurogénesis hipocampal (PCNA y DCX), y se aplicó un análisis multivariado con aprendizaje automático.</w:t>
       </w:r>
     </w:p>
     <w:p>
@@ -252,7 +284,7 @@
         <w:t xml:space="preserve">open field</w:t>
       </w:r>
       <w:r>
-        <w:t xml:space="preserve">, lo que sugiere un perfil de menor ansiedad, en contraste con los expuestos a sacarosa durante la etapa juvenil. Estos últimos no discriminaron el objeto novedoso en ninguna demora del NOR, discriminaron peor en la SLR y presentaron menos neuroblastos en proliferación. La stevia, en cambio, produjo solo déficits aislados en el NOR, sin afectar la memoria consolidada, y no alteró la separación de patrones. Estos resultados sugieren que la stevia es una alternativa al azúcar menos perjudicial durante el desarrollo.</w:t>
+        <w:t xml:space="preserve">, lo que sugiere menor ansiedad, a diferencia de los juveniles expuestos a sacarosa. En las pruebas de memoria, el grupo juvenil expuesto a sacarosa tuvo el peor desempeño en el NOR, y ambas edades presentaron un compromiso en la SLR, asociado con menos neuroblastos en proliferación. Por el contrario, la stevia produjo solo déficits aislados en el NOR, sin afectar la memoria consolidada, y no alteró la separación de patrones. Estos resultados sugieren que la stevia, a diferencia de la sacarosa, produce alteraciones a largo plazo, tras el consumo temprano y en la adultez, caracterizadas por un comportamiento ansiolítico y alteraciones de memoria más sutiles, probablemente sin compromiso de la neurogénesis. Se necesitan más estudios para evaluar a la stevia como alternativa al azúcar, especialmente en etapas tempranas del desarrollo.</w:t>
       </w:r>
     </w:p>
     <w:p>

</xml_diff>

<commit_message>
Resumen condensado a media carilla para la catedra
Co-Authored-By: Claude Opus 5.5 <noreply@anthropic.com>
</commit_message>
<xml_diff>
--- a/entregas/Resumen_catedra.docx
+++ b/entregas/Resumen_catedra.docx
@@ -221,23 +221,7 @@
         <w:pStyle w:val="Justificado"/>
       </w:pPr>
       <w:r>
-        <w:t xml:space="preserve">El consumo de bebidas endulzadas con edulcorantes no calóricos ha crecido exponencialmente; sin embargo, poco se conocen sus efectos a largo plazo. Este estudio comparó los efectos neurobiológicos a largo plazo de una bebida endulzada con stevia con los de una con sacarosa, que, según demostraron estudios previos del laboratorio y de otros grupos, produce alteraciones duraderas de la ansiedad y la memoria. Ratas macho Sprague-Dawley juveniles (PD25) o adultas (PD75) tuvieron acceso</w:t>
-      </w:r>
-      <w:r>
-        <w:t xml:space="preserve"> </w:t>
-      </w:r>
-      <w:r>
-        <w:rPr>
-          <w:iCs/>
-          <w:i/>
-        </w:rPr>
-        <w:t xml:space="preserve">ad libitum</w:t>
-      </w:r>
-      <w:r>
-        <w:t xml:space="preserve"> </w:t>
-      </w:r>
-      <w:r>
-        <w:t xml:space="preserve">durante 25 días a agua (control) o, además, a sacarosa al 10 % (p/v) o a un extracto de</w:t>
+        <w:t xml:space="preserve">El consumo de bebidas con edulcorantes no calóricos ha crecido exponencialmente, pero poco se conocen sus efectos a largo plazo. Este estudio comparó los efectos neurobiológicos a largo plazo de una bebida con stevia con los de una con sacarosa, que, según estudios previos del laboratorio y de otros grupos, altera de forma duradera la ansiedad y la memoria. Ratas macho Sprague-Dawley juveniles (PD25) o adultas (PD75) tuvieron acceso libre durante 25 días a agua (control) o, además, a sacarosa al 10 % o a un extracto de</w:t>
       </w:r>
       <w:r>
         <w:t xml:space="preserve"> </w:t>
@@ -253,7 +237,7 @@
         <w:t xml:space="preserve"> </w:t>
       </w:r>
       <w:r>
-        <w:t xml:space="preserve">Bertoni al 4 % (v/v), y luego solo a agua durante otros 25 días. Después se evaluaron la conducta tipo ansiosa (</w:t>
+        <w:t xml:space="preserve">Bertoni al 4 %, y luego solo a agua durante otros 25 días. Después se evaluaron la conducta tipo ansiosa (</w:t>
       </w:r>
       <w:r>
         <w:rPr>
@@ -271,7 +255,7 @@
         <w:pStyle w:val="Justificado"/>
       </w:pPr>
       <w:r>
-        <w:t xml:space="preserve">Los animales expuestos a stevia exploraron más las zonas centrales del</w:t>
+        <w:t xml:space="preserve">La stevia aumentó la exploración del centro del</w:t>
       </w:r>
       <w:r>
         <w:t xml:space="preserve"> </w:t>
@@ -284,7 +268,7 @@
         <w:t xml:space="preserve">open field</w:t>
       </w:r>
       <w:r>
-        <w:t xml:space="preserve">, lo que sugiere menor ansiedad, a diferencia de los juveniles expuestos a sacarosa. En las pruebas de memoria, el grupo juvenil expuesto a sacarosa tuvo el peor desempeño en el NOR, y ambas edades presentaron un compromiso en la SLR, asociado con menos neuroblastos en proliferación. Por el contrario, la stevia produjo solo déficits aislados en el NOR, sin afectar la memoria consolidada, y no alteró la separación de patrones. Estos resultados sugieren que la stevia, a diferencia de la sacarosa, produce alteraciones a largo plazo, tras el consumo temprano y en la adultez, caracterizadas por un comportamiento ansiolítico y alteraciones de memoria más sutiles, probablemente sin compromiso de la neurogénesis. Se necesitan más estudios para evaluar a la stevia como alternativa al azúcar, especialmente en etapas tempranas del desarrollo.</w:t>
+        <w:t xml:space="preserve">, lo que sugiere menor ansiedad, en contraste con la sacarosa juvenil. La sacarosa juvenil tuvo además el peor desempeño en el NOR, y en ambas edades la sacarosa comprometió la SLR, en asociación con menos neuroblastos en proliferación. La stevia, en cambio, produjo solo déficits aislados en el NOR, sin afectar la memoria consolidada ni la separación de patrones. Estos resultados sugieren que la stevia produce, tanto con el consumo temprano como en la adultez, alteraciones a largo plazo más sutiles que la sacarosa, caracterizadas por un comportamiento ansiolítico y probablemente sin compromiso de la neurogénesis. Se necesitan más estudios para evaluarla como alternativa al azúcar, especialmente durante el desarrollo.</w:t>
       </w:r>
     </w:p>
     <w:p>

</xml_diff>

<commit_message>
Resumen final entregado a la catedra (texto de Thiago)
Co-Authored-By: Claude Opus 5.5 <noreply@anthropic.com>
</commit_message>
<xml_diff>
--- a/entregas/Resumen_catedra.docx
+++ b/entregas/Resumen_catedra.docx
@@ -221,7 +221,23 @@
         <w:pStyle w:val="Justificado"/>
       </w:pPr>
       <w:r>
-        <w:t xml:space="preserve">El consumo de bebidas con edulcorantes no calóricos ha crecido exponencialmente, pero poco se conocen sus efectos a largo plazo. Este estudio comparó los efectos neurobiológicos a largo plazo de una bebida con stevia con los de una con sacarosa, que, según estudios previos del laboratorio y de otros grupos, altera de forma duradera la ansiedad y la memoria. Ratas macho Sprague-Dawley juveniles (PD25) o adultas (PD75) tuvieron acceso libre durante 25 días a agua (control) o, además, a sacarosa al 10 % o a un extracto de</w:t>
+        <w:t xml:space="preserve">El consumo de bebidas endulzadas con edulcorantes no calóricos ha crecido exponencialmente; sin embargo, poco se conocen sus efectos a largo plazo. Este estudio comparó los efectos neurobiológicos a largo plazo de una bebida endulzada con stevia con los de una con sacarosa, que produce alteraciones duraderas de la ansiedad y la memoria. Ratas macho Sprague-Dawley juveniles (PD25) o adultas (PD75) tuvieron acceso</w:t>
+      </w:r>
+      <w:r>
+        <w:t xml:space="preserve"> </w:t>
+      </w:r>
+      <w:r>
+        <w:rPr>
+          <w:iCs/>
+          <w:i/>
+        </w:rPr>
+        <w:t xml:space="preserve">ad libitum</w:t>
+      </w:r>
+      <w:r>
+        <w:t xml:space="preserve"> </w:t>
+      </w:r>
+      <w:r>
+        <w:t xml:space="preserve">durante 25 días a agua (control) o, además, a sacarosa al 10 % (p/v) o a un extracto de</w:t>
       </w:r>
       <w:r>
         <w:t xml:space="preserve"> </w:t>
@@ -237,7 +253,7 @@
         <w:t xml:space="preserve"> </w:t>
       </w:r>
       <w:r>
-        <w:t xml:space="preserve">Bertoni al 4 %, y luego solo a agua durante otros 25 días. Después se evaluaron la conducta tipo ansiosa (</w:t>
+        <w:t xml:space="preserve">Bertoni al 4 % (v/v), y luego solo a agua durante otros 25 días. Después se evaluaron la conducta tipo ansiosa (</w:t>
       </w:r>
       <w:r>
         <w:rPr>
@@ -247,7 +263,7 @@
         <w:t xml:space="preserve">open field</w:t>
       </w:r>
       <w:r>
-        <w:t xml:space="preserve">), la memoria de reconocimiento (NOR), la separación de patrones espaciales (SLR) y la neurogénesis hipocampal (PCNA y DCX), y se aplicó un análisis multivariado con aprendizaje automático.</w:t>
+        <w:t xml:space="preserve">, OF), la memoria de reconocimiento (NOR), la separación de patrones espaciales (SLR) y la neurogénesis hipocampal por inmunocitoquímica (PCNA y DCX), y se aplicó un análisis multivariado con aprendizaje automático.</w:t>
       </w:r>
     </w:p>
     <w:p>
@@ -255,20 +271,7 @@
         <w:pStyle w:val="Justificado"/>
       </w:pPr>
       <w:r>
-        <w:t xml:space="preserve">La stevia aumentó la exploración del centro del</w:t>
-      </w:r>
-      <w:r>
-        <w:t xml:space="preserve"> </w:t>
-      </w:r>
-      <w:r>
-        <w:rPr>
-          <w:iCs/>
-          <w:i/>
-        </w:rPr>
-        <w:t xml:space="preserve">open field</w:t>
-      </w:r>
-      <w:r>
-        <w:t xml:space="preserve">, lo que sugiere menor ansiedad, en contraste con la sacarosa juvenil. La sacarosa juvenil tuvo además el peor desempeño en el NOR, y en ambas edades la sacarosa comprometió la SLR, en asociación con menos neuroblastos en proliferación. La stevia, en cambio, produjo solo déficits aislados en el NOR, sin afectar la memoria consolidada ni la separación de patrones. Estos resultados sugieren que la stevia produce, tanto con el consumo temprano como en la adultez, alteraciones a largo plazo más sutiles que la sacarosa, caracterizadas por un comportamiento ansiolítico y probablemente sin compromiso de la neurogénesis. Se necesitan más estudios para evaluarla como alternativa al azúcar, especialmente durante el desarrollo.</w:t>
+        <w:t xml:space="preserve">Los animales expuestos a stevia exploraron más las zonas centrales del OF, lo que sugiere menor ansiedad, a diferencia de los juveniles expuestos a sacarosa. En las pruebas de memoria, el grupo juvenil expuesto a sacarosa tuvo el peor desempeño en el NOR, y ambas edades presentaron un compromiso en la SLR, asociado con menos neuroblastos en proliferación. Por el contrario, la stevia produjo solo déficits aislados en el NOR, sin afectar la memoria consolidada, y no alteró la separación de patrones. Estos resultados sugieren que la stevia, a diferencia de la sacarosa, produce alteraciones a largo plazo, independientemente de la edad de consumo, caracterizadas por un comportamiento ansiolítico y alteraciones de memoria más sutiles, probablemente sin compromiso de la neurogénesis. Más estudios son necesarios para evaluar a la stevia como alternativa al azúcar, especialmente en etapas tempranas del desarrollo.</w:t>
       </w:r>
     </w:p>
     <w:p>

</xml_diff>